<commit_message>
docs(es2): normalizar rotulación de figuras 1 a 14 y verificar incrustación gráfica
</commit_message>
<xml_diff>
--- a/SECURECODE_Informe_ES2_FINAL_ENTREGA.docx
+++ b/SECURECODE_Informe_ES2_FINAL_ENTREGA.docx
@@ -8736,15 +8736,10 @@
         <w:pStyle w:val="CaptionF"/>
       </w:pPr>
       <w:r>
-        <w:t xml:space="preserve">Figura </w:t>
-      </w:r>
-      <w:fldSimple w:instr=" SEQ Figura \* ARABIC ">
-        <w:r>
-          <w:t>1</w:t>
-        </w:r>
-      </w:fldSimple>
-      <w:r>
-        <w:t xml:space="preserve">. </w:t>
+        <w:rPr>
+          <w:b/>
+        </w:rPr>
+        <w:t xml:space="preserve">Figura 1. </w:t>
       </w:r>
       <w:r>
         <w:rPr>
@@ -9495,15 +9490,10 @@
         <w:pStyle w:val="CaptionF"/>
       </w:pPr>
       <w:r>
-        <w:t xml:space="preserve">Figura </w:t>
-      </w:r>
-      <w:fldSimple w:instr=" SEQ Figura \* ARABIC ">
-        <w:r>
-          <w:t>2</w:t>
-        </w:r>
-      </w:fldSimple>
-      <w:r>
-        <w:t xml:space="preserve">. </w:t>
+        <w:rPr>
+          <w:b/>
+        </w:rPr>
+        <w:t xml:space="preserve">Figura 2. </w:t>
       </w:r>
       <w:r>
         <w:rPr>
@@ -10062,15 +10052,10 @@
         <w:pStyle w:val="CaptionF"/>
       </w:pPr>
       <w:r>
-        <w:t xml:space="preserve">Figura </w:t>
-      </w:r>
-      <w:fldSimple w:instr=" SEQ Figura \* ARABIC ">
-        <w:r>
-          <w:t>3</w:t>
-        </w:r>
-      </w:fldSimple>
-      <w:r>
-        <w:t xml:space="preserve">. </w:t>
+        <w:rPr>
+          <w:b/>
+        </w:rPr>
+        <w:t xml:space="preserve">Figura 3. </w:t>
       </w:r>
       <w:r>
         <w:rPr>
@@ -10173,15 +10158,10 @@
         <w:pStyle w:val="CaptionF"/>
       </w:pPr>
       <w:r>
-        <w:t xml:space="preserve">Figura </w:t>
-      </w:r>
-      <w:fldSimple w:instr=" SEQ Figura \* ARABIC ">
-        <w:r>
-          <w:t>4</w:t>
-        </w:r>
-      </w:fldSimple>
-      <w:r>
-        <w:t xml:space="preserve">. </w:t>
+        <w:rPr>
+          <w:b/>
+        </w:rPr>
+        <w:t xml:space="preserve">Figura 4. </w:t>
       </w:r>
       <w:r>
         <w:rPr>
@@ -11494,15 +11474,10 @@
         <w:pStyle w:val="CaptionF"/>
       </w:pPr>
       <w:r>
-        <w:t xml:space="preserve">Figura </w:t>
-      </w:r>
-      <w:fldSimple w:instr=" SEQ Figura \* ARABIC ">
-        <w:r>
-          <w:t>5</w:t>
-        </w:r>
-      </w:fldSimple>
-      <w:r>
-        <w:t xml:space="preserve">. </w:t>
+        <w:rPr>
+          <w:b/>
+        </w:rPr>
+        <w:t xml:space="preserve">Figura 5. </w:t>
       </w:r>
       <w:r>
         <w:rPr>
@@ -12567,15 +12542,10 @@
         <w:pStyle w:val="CaptionF"/>
       </w:pPr>
       <w:r>
-        <w:t xml:space="preserve">Figura </w:t>
-      </w:r>
-      <w:fldSimple w:instr=" SEQ Figura \* ARABIC ">
-        <w:r>
-          <w:t>6</w:t>
-        </w:r>
-      </w:fldSimple>
-      <w:r>
-        <w:t xml:space="preserve">. </w:t>
+        <w:rPr>
+          <w:b/>
+        </w:rPr>
+        <w:t xml:space="preserve">Figura 6. </w:t>
       </w:r>
       <w:r>
         <w:rPr>
@@ -14760,15 +14730,10 @@
         <w:pStyle w:val="CaptionF"/>
       </w:pPr>
       <w:r>
-        <w:t xml:space="preserve">Figura </w:t>
-      </w:r>
-      <w:fldSimple w:instr=" SEQ Figura \* ARABIC ">
-        <w:r>
-          <w:t>7</w:t>
-        </w:r>
-      </w:fldSimple>
-      <w:r>
-        <w:t xml:space="preserve">. </w:t>
+        <w:rPr>
+          <w:b/>
+        </w:rPr>
+        <w:t xml:space="preserve">Figura 7. </w:t>
       </w:r>
       <w:r>
         <w:rPr>
@@ -15415,15 +15380,10 @@
         <w:pStyle w:val="CaptionF"/>
       </w:pPr>
       <w:r>
-        <w:t xml:space="preserve">Figura </w:t>
-      </w:r>
-      <w:fldSimple w:instr=" SEQ Figura \* ARABIC ">
-        <w:r>
-          <w:t>8</w:t>
-        </w:r>
-      </w:fldSimple>
-      <w:r>
-        <w:t xml:space="preserve">. </w:t>
+        <w:rPr>
+          <w:b/>
+        </w:rPr>
+        <w:t xml:space="preserve">Figura 8. </w:t>
       </w:r>
       <w:r>
         <w:rPr>
@@ -16237,15 +16197,10 @@
         <w:pStyle w:val="CaptionF"/>
       </w:pPr>
       <w:r>
-        <w:t xml:space="preserve">Figura </w:t>
-      </w:r>
-      <w:fldSimple w:instr=" SEQ Figura \* ARABIC ">
-        <w:r>
-          <w:t>9</w:t>
-        </w:r>
-      </w:fldSimple>
-      <w:r>
-        <w:t xml:space="preserve">. </w:t>
+        <w:rPr>
+          <w:b/>
+        </w:rPr>
+        <w:t xml:space="preserve">Figura 9. </w:t>
       </w:r>
       <w:r>
         <w:rPr>
@@ -17678,15 +17633,10 @@
         <w:jc w:val="both"/>
       </w:pPr>
       <w:r>
-        <w:t xml:space="preserve">Figura </w:t>
-      </w:r>
-      <w:fldSimple w:instr=" SEQ Figura \* ARABIC ">
-        <w:r>
-          <w:t>10</w:t>
-        </w:r>
-      </w:fldSimple>
-      <w:r>
-        <w:t xml:space="preserve">. </w:t>
+        <w:rPr>
+          <w:b/>
+        </w:rPr>
+        <w:t xml:space="preserve">Figura 10. </w:t>
       </w:r>
       <w:r>
         <w:rPr>
@@ -18207,15 +18157,10 @@
         <w:jc w:val="both"/>
       </w:pPr>
       <w:r>
-        <w:t xml:space="preserve">Figura </w:t>
-      </w:r>
-      <w:fldSimple w:instr=" SEQ Figura \* ARABIC ">
-        <w:r>
-          <w:t>11</w:t>
-        </w:r>
-      </w:fldSimple>
-      <w:r>
-        <w:t xml:space="preserve">. </w:t>
+        <w:rPr>
+          <w:b/>
+        </w:rPr>
+        <w:t xml:space="preserve">Figura 11. </w:t>
       </w:r>
       <w:r>
         <w:rPr>
@@ -24683,15 +24628,10 @@
         <w:pStyle w:val="CaptionF"/>
       </w:pPr>
       <w:r>
-        <w:t xml:space="preserve">Figura </w:t>
-      </w:r>
-      <w:fldSimple w:instr=" SEQ Figura \* ARABIC ">
-        <w:r>
-          <w:t>12</w:t>
-        </w:r>
-      </w:fldSimple>
-      <w:r>
-        <w:t xml:space="preserve">. </w:t>
+        <w:rPr>
+          <w:b/>
+        </w:rPr>
+        <w:t xml:space="preserve">Figura 12. </w:t>
       </w:r>
       <w:r>
         <w:rPr>
@@ -29169,15 +29109,10 @@
         <w:pStyle w:val="CaptionF"/>
       </w:pPr>
       <w:r>
-        <w:t xml:space="preserve">Figura </w:t>
-      </w:r>
-      <w:fldSimple w:instr=" SEQ Figura \* ARABIC ">
-        <w:r>
-          <w:t>13</w:t>
-        </w:r>
-      </w:fldSimple>
-      <w:r>
-        <w:t xml:space="preserve">. </w:t>
+        <w:rPr>
+          <w:b/>
+        </w:rPr>
+        <w:t xml:space="preserve">Figura 13. </w:t>
       </w:r>
       <w:r>
         <w:rPr>
@@ -35467,15 +35402,10 @@
         <w:pStyle w:val="CaptionF"/>
       </w:pPr>
       <w:r>
-        <w:t xml:space="preserve">Figura </w:t>
-      </w:r>
-      <w:fldSimple w:instr=" SEQ Figura \* ARABIC ">
-        <w:r>
-          <w:t>14</w:t>
-        </w:r>
-      </w:fldSimple>
-      <w:r>
-        <w:t xml:space="preserve">. </w:t>
+        <w:rPr>
+          <w:b/>
+        </w:rPr>
+        <w:t xml:space="preserve">Figura 14. </w:t>
       </w:r>
       <w:r>
         <w:rPr>

</xml_diff>